<commit_message>
process tweaks and clearer naming
</commit_message>
<xml_diff>
--- a/templates/docx/build-specification.docx
+++ b/templates/docx/build-specification.docx
@@ -56,7 +56,7 @@
           <w:color w:val="ED1B24"/>
           <w:sz w:val="16"/>
         </w:rPr>
-        <w:t>Gate 10   |   Routes: standard / full   |   Version: v0.1 draft → v1.0 on approval → v1.1 after a logged change</w:t>
+        <w:t>Approval: build specification   |   Routes: standard / full   |   Version: v0.1 draft → v1.0 on approval → v1.1 after a logged change</w:t>
       </w:r>
     </w:p>
     <w:p>
@@ -1885,7 +1885,7 @@
                 <w:color w:val="404042"/>
                 <w:sz w:val="18"/>
               </w:rPr>
-              <w:t>The difference between the Gate 1 baseline and this re-baseline is one of the most useful numbers the process produces. Project after project it shows where estimating is systematically wrong — and that is worth more than any single estimate.</w:t>
+              <w:t>The difference between the Discovery baseline and this re-baseline is one of the most useful numbers the process produces. Project after project it shows where estimating is systematically wrong — and that is worth more than any single estimate.</w:t>
             </w:r>
           </w:p>
         </w:tc>
@@ -1932,7 +1932,7 @@
                 <w:color w:val="FFFFFF"/>
                 <w:sz w:val="18"/>
               </w:rPr>
-              <w:t>Gate 1 baseline</w:t>
+              <w:t>Discovery baseline</w:t>
             </w:r>
           </w:p>
         </w:tc>
@@ -1948,7 +1948,7 @@
                 <w:color w:val="FFFFFF"/>
                 <w:sz w:val="18"/>
               </w:rPr>
-              <w:t>Gate 10 re-baseline</w:t>
+              <w:t>Build spec re-baseline</w:t>
             </w:r>
           </w:p>
         </w:tc>
@@ -2754,7 +2754,7 @@
                 <w:color w:val="6A6A6A"/>
                 <w:sz w:val="17"/>
               </w:rPr>
-              <w:t>From Gate 1 — QA tests against this and nothing beyond it</w:t>
+              <w:t>From the discovery approval — QA tests against this and nothing beyond it</w:t>
             </w:r>
           </w:p>
         </w:tc>
@@ -2787,7 +2787,7 @@
                 <w:color w:val="6A6A6A"/>
                 <w:sz w:val="17"/>
               </w:rPr>
-              <w:t>From Gate 1</w:t>
+              <w:t>From the discovery approval</w:t>
             </w:r>
           </w:p>
         </w:tc>

</xml_diff>